<commit_message>
"Go well." belongs to the app; the paper gets a gift instead
The published recitation ends at "I am ready." The closing line is
spoken by the app, after the words, and it has no business on a printed
sheet. check-text now enforces its absence from every source, and
build-downloads checks its own output — checking the downloads in
check-text would have let a stale artefact block the rebuild that fixes
it, which it promptly did.

In its place, on paper and in the downloads only: a gift from Narath at
MakeTimeFlow, and the URL, so someone holding a printout knows where to
get their own.

Co-Authored-By: Claude Opus 5 (1M context) <noreply@anthropic.com>
Claude-Session: https://claude.ai/code/session_012uKm8wQdXcfddRcVrivBAM
</commit_message>
<xml_diff>
--- a/downloads/great-mornings-recitation.docx
+++ b/downloads/great-mornings-recitation.docx
@@ -176,21 +176,23 @@
           <w:sz-cs w:val="24"/>
           <w:spacing w:val="0"/>
         </w:rPr>
-        <w:t xml:space="preserve">Go well.</w:t>
-      </w:r>
-    </w:p>
-    <w:p>
-      <w:pPr>
-        <w:spacing w:after="240"/>
-      </w:pPr>
-      <w:r>
-        <w:rPr>
-          <w:rFonts w:ascii="Times" w:hAnsi="Times" w:cs="Times"/>
-          <w:sz w:val="24"/>
-          <w:sz-cs w:val="24"/>
-          <w:spacing w:val="0"/>
-        </w:rPr>
-        <w:t xml:space="preserve">"What makes for a great morning?" by Narath Carlile · CC BY 4.0 · mornings.maketimeflow.com</w:t>
+        <w:t xml:space="preserve">A gift from Narath at MakeTimeFlow, in the hope of improving your life,</w:t>
+        <w:br/>
+        <w:t xml:space="preserve">the lives of those you love, our communities and our earth.</w:t>
+      </w:r>
+    </w:p>
+    <w:p>
+      <w:pPr>
+        <w:spacing w:after="240"/>
+      </w:pPr>
+      <w:r>
+        <w:rPr>
+          <w:rFonts w:ascii="Times" w:hAnsi="Times" w:cs="Times"/>
+          <w:sz w:val="24"/>
+          <w:sz-cs w:val="24"/>
+          <w:spacing w:val="0"/>
+        </w:rPr>
+        <w:t xml:space="preserve">mornings.maketimeflow.com · "What makes for a great morning?" · CC BY 4.0</w:t>
       </w:r>
     </w:p>
     <w:sectPr/>

</xml_diff>